<commit_message>
Replace Wikipedia references with stronger sources
- Remove both Wikipedia entries (6-7 meme; Doot Doot)
- Cite primary song release (Skrilla, 2025, Priority Records) and the
  Complex/WHYY/Bleacher Report press for origin and release facts
- Cite Know Your Meme (edited meme database) for the '67 Kid' facts
- Update in-text citations and Table 1 evidence-appraisal rows accordingly

https://claude.ai/code/session_011aLbSQp45dQjyGbQrfjLUc
</commit_message>
<xml_diff>
--- a/Phatic-Only_Slang_6-7_NarrativeReview.docx
+++ b/Phatic-Only_Slang_6-7_NarrativeReview.docx
@@ -677,7 +677,7 @@
                 <w:rFonts w:ascii="Times New Roman" w:hAnsi="Times New Roman"/>
                 <w:sz w:val="18"/>
               </w:rPr>
-              <w:t>Complex, 2025; WHYY, 2025; Wikipedia, n.d.-b</w:t>
+              <w:t>Complex, 2025; WHYY, 2025; Skrilla, 2025</w:t>
             </w:r>
           </w:p>
         </w:tc>
@@ -694,7 +694,7 @@
                 <w:rFonts w:ascii="Times New Roman" w:hAnsi="Times New Roman"/>
                 <w:sz w:val="18"/>
               </w:rPr>
-              <w:t>Reputable press + creator</w:t>
+              <w:t>Creator interview + primary release</w:t>
             </w:r>
           </w:p>
         </w:tc>
@@ -747,7 +747,7 @@
                 <w:rFonts w:ascii="Times New Roman" w:hAnsi="Times New Roman"/>
                 <w:sz w:val="18"/>
               </w:rPr>
-              <w:t>Wikipedia, n.d.-b; Bleacher Report, n.d.</w:t>
+              <w:t>Skrilla, 2025; Bleacher Report, n.d.</w:t>
             </w:r>
           </w:p>
         </w:tc>
@@ -764,7 +764,7 @@
                 <w:rFonts w:ascii="Times New Roman" w:hAnsi="Times New Roman"/>
                 <w:sz w:val="18"/>
               </w:rPr>
-              <w:t>Reputable press</w:t>
+              <w:t>Primary release + press</w:t>
             </w:r>
           </w:p>
         </w:tc>
@@ -957,7 +957,7 @@
                 <w:rFonts w:ascii="Times New Roman" w:hAnsi="Times New Roman"/>
                 <w:sz w:val="18"/>
               </w:rPr>
-              <w:t>Wikipedia, n.d.-a</w:t>
+              <w:t>Know Your Meme, n.d.</w:t>
             </w:r>
           </w:p>
         </w:tc>
@@ -974,7 +974,7 @@
                 <w:rFonts w:ascii="Times New Roman" w:hAnsi="Times New Roman"/>
                 <w:sz w:val="18"/>
               </w:rPr>
-              <w:t>Reputable press</w:t>
+              <w:t>Edited meme database</w:t>
             </w:r>
           </w:p>
         </w:tc>
@@ -1709,7 +1709,7 @@
           <w:rFonts w:ascii="Times New Roman" w:hAnsi="Times New Roman"/>
           <w:sz w:val="22"/>
         </w:rPr>
-        <w:t xml:space="preserve"> (Wikipedia contributors, n.d.-b). Crucially, the phrase was born semantically underdetermined: Skrilla has declined to fix its meaning, reportedly saying “I never put an actual meaning on it, and I still would not want to,” and elsewhere describing it as representing “what comes up in my head” (Complex, 2025; WHYY, 2025). Proposed sources—a Philadelphia or Chicago street, or, per linguist Taylor Jones, the police ten-code </w:t>
+        <w:t xml:space="preserve"> (Skrilla, 2025; Complex, 2025). Crucially, the phrase was born semantically underdetermined: Skrilla has declined to fix its meaning, reportedly saying “I never put an actual meaning on it, and I still would not want to,” and elsewhere describing it as representing “what comes up in my head” (Complex, 2025; WHYY, 2025). Proposed sources—a Philadelphia or Chicago street, or, per linguist Taylor Jones, the police ten-code </w:t>
       </w:r>
       <w:r>
         <w:rPr>
@@ -1750,7 +1750,7 @@
           <w:rFonts w:ascii="Times New Roman" w:hAnsi="Times New Roman"/>
           <w:sz w:val="22"/>
         </w:rPr>
-        <w:t xml:space="preserve">The phrase migrated from music to mass meme through basketball. Highlight edits paired the lyric with footage of players listed at six-foot-seven, most prominently LaMelo Ball (2.01 m), exploiting the literal height coincidence (Bleacher Report, n.d.). On 31 March 2025 a YouTube AAU-basketball video by Cam Wilder featured a young boy—later dubbed the “67 Kid”—shouting “six seven” with a palms-up, alternating up-and-down hand gesture; the clip became a primary vector of virality (Wikipedia contributors, n.d.-a). By autumn 2025 the term saturated NBA and WNBA media, NFL celebrations, and celebrity content—Shaquille O’Neal reportedly joined in while admitting he did not understand it, a telling detail for a term whose use is detached from comprehension. Dictionary.com (2025) reported that </w:t>
+        <w:t xml:space="preserve">The phrase migrated from music to mass meme through basketball. Highlight edits paired the lyric with footage of players listed at six-foot-seven, most prominently LaMelo Ball (2.01 m), exploiting the literal height coincidence (Bleacher Report, n.d.). On 31 March 2025 a YouTube AAU-basketball video by Cam Wilder featured a young boy—later dubbed the “67 Kid”—shouting “six seven” with a palms-up, alternating up-and-down hand gesture; the clip became a primary vector of virality (Know Your Meme, n.d.). By autumn 2025 the term saturated NBA and WNBA media, NFL celebrations, and celebrity content—Shaquille O’Neal reportedly joined in while admitting he did not understand it, a telling detail for a term whose use is detached from comprehension. Dictionary.com (2025) reported that </w:t>
       </w:r>
       <w:r>
         <w:rPr>
@@ -5310,7 +5310,7 @@
           <w:rFonts w:ascii="Times New Roman" w:hAnsi="Times New Roman"/>
           <w:sz w:val="20"/>
         </w:rPr>
-        <w:t xml:space="preserve">Malinowski, B. (1923). The problem of meaning in primitive languages. In C. K. Ogden &amp; I. A. Richards, </w:t>
+        <w:t xml:space="preserve">Know Your Meme. (n.d.). </w:t>
       </w:r>
       <w:r>
         <w:rPr>
@@ -5318,15 +5318,26 @@
           <w:i/>
           <w:sz w:val="20"/>
         </w:rPr>
-        <w:t>The meaning of meaning</w:t>
+        <w:t>67 kid</w:t>
       </w:r>
       <w:r>
         <w:rPr>
           <w:rFonts w:ascii="Times New Roman" w:hAnsi="Times New Roman"/>
           <w:sz w:val="20"/>
         </w:rPr>
-        <w:t xml:space="preserve"> (pp. 296–336). Kegan Paul.</w:t>
-      </w:r>
+        <w:t xml:space="preserve">. Literally Media. Retrieved June 4, 2026, from </w:t>
+      </w:r>
+      <w:hyperlink r:id="rId25">
+        <w:r>
+          <w:rPr>
+            <w:rFonts w:ascii="Times New Roman" w:hAnsi="Times New Roman"/>
+            <w:sz w:val="20"/>
+            <w:color w:val="0000FF"/>
+            <w:u w:val="single"/>
+          </w:rPr>
+          <w:t xml:space="preserve">https://knowyourmeme.com/memes/67-kid</w:t>
+        </w:r>
+      </w:hyperlink>
     </w:p>
     <w:p>
       <w:pPr>
@@ -5338,7 +5349,7 @@
           <w:rFonts w:ascii="Times New Roman" w:hAnsi="Times New Roman"/>
           <w:sz w:val="20"/>
         </w:rPr>
-        <w:t xml:space="preserve">McCulloch, G. (2019). </w:t>
+        <w:t xml:space="preserve">Malinowski, B. (1923). The problem of meaning in primitive languages. In C. K. Ogden &amp; I. A. Richards, </w:t>
       </w:r>
       <w:r>
         <w:rPr>
@@ -5346,14 +5357,14 @@
           <w:i/>
           <w:sz w:val="20"/>
         </w:rPr>
-        <w:t>Because internet: Understanding the new rules of language</w:t>
+        <w:t>The meaning of meaning</w:t>
       </w:r>
       <w:r>
         <w:rPr>
           <w:rFonts w:ascii="Times New Roman" w:hAnsi="Times New Roman"/>
           <w:sz w:val="20"/>
         </w:rPr>
-        <w:t>. Riverhead Books.</w:t>
+        <w:t xml:space="preserve"> (pp. 296–336). Kegan Paul.</w:t>
       </w:r>
     </w:p>
     <w:p>
@@ -5366,7 +5377,7 @@
           <w:rFonts w:ascii="Times New Roman" w:hAnsi="Times New Roman"/>
           <w:sz w:val="20"/>
         </w:rPr>
-        <w:t xml:space="preserve">Merriam-Webster. (n.d.). Six seven. In </w:t>
+        <w:t xml:space="preserve">McCulloch, G. (2019). </w:t>
       </w:r>
       <w:r>
         <w:rPr>
@@ -5374,6 +5385,34 @@
           <w:i/>
           <w:sz w:val="20"/>
         </w:rPr>
+        <w:t>Because internet: Understanding the new rules of language</w:t>
+      </w:r>
+      <w:r>
+        <w:rPr>
+          <w:rFonts w:ascii="Times New Roman" w:hAnsi="Times New Roman"/>
+          <w:sz w:val="20"/>
+        </w:rPr>
+        <w:t>. Riverhead Books.</w:t>
+      </w:r>
+    </w:p>
+    <w:p>
+      <w:pPr>
+        <w:spacing w:before="0" w:after="80" w:line="240" w:lineRule="auto"/>
+        <w:ind w:left="720" w:hanging="720"/>
+      </w:pPr>
+      <w:r>
+        <w:rPr>
+          <w:rFonts w:ascii="Times New Roman" w:hAnsi="Times New Roman"/>
+          <w:sz w:val="20"/>
+        </w:rPr>
+        <w:t xml:space="preserve">Merriam-Webster. (n.d.). Six seven. In </w:t>
+      </w:r>
+      <w:r>
+        <w:rPr>
+          <w:rFonts w:ascii="Times New Roman" w:hAnsi="Times New Roman"/>
+          <w:i/>
+          <w:sz w:val="20"/>
+        </w:rPr>
         <w:t>Merriam-Webster slang dictionary</w:t>
       </w:r>
       <w:r>
@@ -5383,7 +5422,7 @@
         </w:rPr>
         <w:t xml:space="preserve">. Retrieved June 4, 2026, from </w:t>
       </w:r>
-      <w:hyperlink r:id="rId25">
+      <w:hyperlink r:id="rId26">
         <w:r>
           <w:rPr>
             <w:rFonts w:ascii="Times New Roman" w:hAnsi="Times New Roman"/>
@@ -5422,7 +5461,7 @@
         </w:rPr>
         <w:t xml:space="preserve">(4), 387–400. </w:t>
       </w:r>
-      <w:hyperlink r:id="rId26">
+      <w:hyperlink r:id="rId27">
         <w:r>
           <w:rPr>
             <w:rFonts w:ascii="Times New Roman" w:hAnsi="Times New Roman"/>
@@ -5461,7 +5500,7 @@
         </w:rPr>
         <w:t xml:space="preserve">. </w:t>
       </w:r>
-      <w:hyperlink r:id="rId27">
+      <w:hyperlink r:id="rId28">
         <w:r>
           <w:rPr>
             <w:rFonts w:ascii="Times New Roman" w:hAnsi="Times New Roman"/>
@@ -5500,7 +5539,7 @@
         </w:rPr>
         <w:t xml:space="preserve">. </w:t>
       </w:r>
-      <w:hyperlink r:id="rId28">
+      <w:hyperlink r:id="rId29">
         <w:r>
           <w:rPr>
             <w:rFonts w:ascii="Times New Roman" w:hAnsi="Times New Roman"/>
@@ -5567,7 +5606,7 @@
         </w:rPr>
         <w:t xml:space="preserve">(2), 165–198. </w:t>
       </w:r>
-      <w:hyperlink r:id="rId29">
+      <w:hyperlink r:id="rId30">
         <w:r>
           <w:rPr>
             <w:rFonts w:ascii="Times New Roman" w:hAnsi="Times New Roman"/>
@@ -5606,7 +5645,7 @@
         </w:rPr>
         <w:t xml:space="preserve">(3–4), 193–229. </w:t>
       </w:r>
-      <w:hyperlink r:id="rId30">
+      <w:hyperlink r:id="rId31">
         <w:r>
           <w:rPr>
             <w:rFonts w:ascii="Times New Roman" w:hAnsi="Times New Roman"/>
@@ -5635,7 +5674,7 @@
           <w:rFonts w:ascii="Times New Roman" w:hAnsi="Times New Roman"/>
           <w:sz w:val="20"/>
         </w:rPr>
-        <w:t xml:space="preserve">Smithsonian Magazine. (2025, October 30). </w:t>
+        <w:t xml:space="preserve">Skrilla. (2025). </w:t>
       </w:r>
       <w:r>
         <w:rPr>
@@ -5643,6 +5682,34 @@
           <w:i/>
           <w:sz w:val="20"/>
         </w:rPr>
+        <w:t>Doot doot (6 7)</w:t>
+      </w:r>
+      <w:r>
+        <w:rPr>
+          <w:rFonts w:ascii="Times New Roman" w:hAnsi="Times New Roman"/>
+          <w:sz w:val="20"/>
+        </w:rPr>
+        <w:t xml:space="preserve"> [Song]. Priority Records.</w:t>
+      </w:r>
+    </w:p>
+    <w:p>
+      <w:pPr>
+        <w:spacing w:before="0" w:after="80" w:line="240" w:lineRule="auto"/>
+        <w:ind w:left="720" w:hanging="720"/>
+      </w:pPr>
+      <w:r>
+        <w:rPr>
+          <w:rFonts w:ascii="Times New Roman" w:hAnsi="Times New Roman"/>
+          <w:sz w:val="20"/>
+        </w:rPr>
+        <w:t xml:space="preserve">Smithsonian Magazine. (2025, October 30). </w:t>
+      </w:r>
+      <w:r>
+        <w:rPr>
+          <w:rFonts w:ascii="Times New Roman" w:hAnsi="Times New Roman"/>
+          <w:i/>
+          <w:sz w:val="20"/>
+        </w:rPr>
         <w:t>The term “67” is impossible to define. It just became Dictionary.com’s word of the year for 2025</w:t>
       </w:r>
       <w:r>
@@ -5652,7 +5719,7 @@
         </w:rPr>
         <w:t xml:space="preserve">. </w:t>
       </w:r>
-      <w:hyperlink r:id="rId31">
+      <w:hyperlink r:id="rId32">
         <w:r>
           <w:rPr>
             <w:rFonts w:ascii="Times New Roman" w:hAnsi="Times New Roman"/>
@@ -5691,7 +5758,7 @@
         </w:rPr>
         <w:t xml:space="preserve">. </w:t>
       </w:r>
-      <w:hyperlink r:id="rId32">
+      <w:hyperlink r:id="rId33">
         <w:r>
           <w:rPr>
             <w:rFonts w:ascii="Times New Roman" w:hAnsi="Times New Roman"/>
@@ -5730,7 +5797,7 @@
         </w:rPr>
         <w:t xml:space="preserve"> </w:t>
       </w:r>
-      <w:hyperlink r:id="rId33">
+      <w:hyperlink r:id="rId34">
         <w:r>
           <w:rPr>
             <w:rFonts w:ascii="Times New Roman" w:hAnsi="Times New Roman"/>
@@ -5769,7 +5836,7 @@
         </w:rPr>
         <w:t xml:space="preserve">. </w:t>
       </w:r>
-      <w:hyperlink r:id="rId34">
+      <w:hyperlink r:id="rId35">
         <w:r>
           <w:rPr>
             <w:rFonts w:ascii="Times New Roman" w:hAnsi="Times New Roman"/>
@@ -5808,7 +5875,7 @@
         </w:rPr>
         <w:t xml:space="preserve">. </w:t>
       </w:r>
-      <w:hyperlink r:id="rId35">
+      <w:hyperlink r:id="rId36">
         <w:r>
           <w:rPr>
             <w:rFonts w:ascii="Times New Roman" w:hAnsi="Times New Roman"/>
@@ -5819,98 +5886,6 @@
           <w:t xml:space="preserve">https://whyy.org/articles/meaning-6-7-skrilla-philadelphia/</w:t>
         </w:r>
       </w:hyperlink>
-    </w:p>
-    <w:p>
-      <w:pPr>
-        <w:spacing w:before="0" w:after="80" w:line="240" w:lineRule="auto"/>
-        <w:ind w:left="720" w:hanging="720"/>
-      </w:pPr>
-      <w:r>
-        <w:rPr>
-          <w:rFonts w:ascii="Times New Roman" w:hAnsi="Times New Roman"/>
-          <w:sz w:val="20"/>
-        </w:rPr>
-        <w:t xml:space="preserve">Wikipedia contributors. (n.d.-a). 6-7 (meme). In </w:t>
-      </w:r>
-      <w:r>
-        <w:rPr>
-          <w:rFonts w:ascii="Times New Roman" w:hAnsi="Times New Roman"/>
-          <w:i/>
-          <w:sz w:val="20"/>
-        </w:rPr>
-        <w:t>Wikipedia</w:t>
-      </w:r>
-      <w:r>
-        <w:rPr>
-          <w:rFonts w:ascii="Times New Roman" w:hAnsi="Times New Roman"/>
-          <w:sz w:val="20"/>
-        </w:rPr>
-        <w:t xml:space="preserve">. Retrieved June 4, 2026, from </w:t>
-      </w:r>
-      <w:hyperlink r:id="rId36">
-        <w:r>
-          <w:rPr>
-            <w:rFonts w:ascii="Times New Roman" w:hAnsi="Times New Roman"/>
-            <w:sz w:val="20"/>
-            <w:color w:val="0000FF"/>
-            <w:u w:val="single"/>
-          </w:rPr>
-          <w:t xml:space="preserve">https://en.wikipedia.org/wiki/6-7_(meme</w:t>
-        </w:r>
-      </w:hyperlink>
-      <w:r>
-        <w:rPr>
-          <w:rFonts w:ascii="Times New Roman" w:hAnsi="Times New Roman"/>
-          <w:sz w:val="20"/>
-        </w:rPr>
-        <w:t>)</w:t>
-      </w:r>
-    </w:p>
-    <w:p>
-      <w:pPr>
-        <w:spacing w:before="0" w:after="80" w:line="240" w:lineRule="auto"/>
-        <w:ind w:left="720" w:hanging="720"/>
-      </w:pPr>
-      <w:r>
-        <w:rPr>
-          <w:rFonts w:ascii="Times New Roman" w:hAnsi="Times New Roman"/>
-          <w:sz w:val="20"/>
-        </w:rPr>
-        <w:t xml:space="preserve">Wikipedia contributors. (n.d.-b). Doot doot (6 7). In </w:t>
-      </w:r>
-      <w:r>
-        <w:rPr>
-          <w:rFonts w:ascii="Times New Roman" w:hAnsi="Times New Roman"/>
-          <w:i/>
-          <w:sz w:val="20"/>
-        </w:rPr>
-        <w:t>Wikipedia</w:t>
-      </w:r>
-      <w:r>
-        <w:rPr>
-          <w:rFonts w:ascii="Times New Roman" w:hAnsi="Times New Roman"/>
-          <w:sz w:val="20"/>
-        </w:rPr>
-        <w:t xml:space="preserve">. Retrieved June 4, 2026, from </w:t>
-      </w:r>
-      <w:hyperlink r:id="rId37">
-        <w:r>
-          <w:rPr>
-            <w:rFonts w:ascii="Times New Roman" w:hAnsi="Times New Roman"/>
-            <w:sz w:val="20"/>
-            <w:color w:val="0000FF"/>
-            <w:u w:val="single"/>
-          </w:rPr>
-          <w:t xml:space="preserve">https://en.wikipedia.org/wiki/Doot_Doot_(6_7</w:t>
-        </w:r>
-      </w:hyperlink>
-      <w:r>
-        <w:rPr>
-          <w:rFonts w:ascii="Times New Roman" w:hAnsi="Times New Roman"/>
-          <w:sz w:val="20"/>
-        </w:rPr>
-        <w:t>)</w:t>
-      </w:r>
     </w:p>
     <w:p>
       <w:pPr>

</xml_diff>

<commit_message>
Finalize narrative review: add Cruse/Bybee/Tarski refs, fix alphabetization
- Add academic references for Cruse (1986), Bybee (2010), Tarski (1944)
  and cite them in-text (closing the last named-but-unreferenced gaps)
- Correct reference ordering (Blakemore before Bleacher Report)
- Final QA: 41 refs all cited, alphabetized; no orphan citations;
  no Wikipedia; 4 tables (+notes), 4 figures, 25 hyperlinks

https://claude.ai/code/session_011aLbSQp45dQjyGbQrfjLUc
</commit_message>
<xml_diff>
--- a/Phatic-Only_Slang_6-7_NarrativeReview.docx
+++ b/Phatic-Only_Slang_6-7_NarrativeReview.docx
@@ -2026,7 +2026,7 @@
           <w:rFonts w:ascii="Times New Roman" w:hAnsi="Times New Roman"/>
           <w:sz w:val="22"/>
         </w:rPr>
-        <w:t xml:space="preserve">) keeps reference central: “the morning star” and “the evening star” differ in sense yet share a referent, Venus. Truth-conditional semantics, developed by Davidson (1967) on Tarski’s theory of truth, holds that to give the meaning of a sentence is to give its truth conditions, so that a word’s meaning is its contribution to those conditions. The difficulty is immediate: </w:t>
+        <w:t xml:space="preserve">) keeps reference central: “the morning star” and “the evening star” differ in sense yet share a referent, Venus. Truth-conditional semantics, developed by Davidson (1967) on Tarski’s (1944) theory of truth, holds that to give the meaning of a sentence is to give its truth conditions, so that a word’s meaning is its contribution to those conditions. The difficulty is immediate: </w:t>
       </w:r>
       <w:r>
         <w:rPr>
@@ -2054,7 +2054,7 @@
           <w:rFonts w:ascii="Times New Roman" w:hAnsi="Times New Roman"/>
           <w:sz w:val="22"/>
         </w:rPr>
-        <w:t xml:space="preserve">Lexical semantics, in turn, studies word meaning and the sense relations—synonymy, hyponymy, antonymy, polysemy—that structure the lexicon (Jurafsky &amp; Martin, 2023). Identifying lexical meaning purely with reference makes it hard to account for synonymy and analytic entailment, so the field distinguishes an inferential aspect of lexical competence (relations among senses) from a referential aspect (naming and application) (Stanford Encyclopedia of Philosophy, n.d.). </w:t>
+        <w:t xml:space="preserve">Lexical semantics, in turn, studies word meaning and the sense relations—synonymy, hyponymy, antonymy, polysemy—that structure the lexicon (Cruse, 1986; Jurafsky &amp; Martin, 2023). Identifying lexical meaning purely with reference makes it hard to account for synonymy and analytic entailment, so the field distinguishes an inferential aspect of lexical competence (relations among senses) from a referential aspect (naming and application) (Stanford Encyclopedia of Philosophy, n.d.). </w:t>
       </w:r>
       <w:r>
         <w:rPr>
@@ -2155,7 +2155,7 @@
           <w:rFonts w:ascii="Times New Roman" w:hAnsi="Times New Roman"/>
           <w:sz w:val="22"/>
         </w:rPr>
-        <w:t xml:space="preserve"> falls squarely in the use-governed, non-ostensive class he had in mind. Three further frameworks bear on slang: Firth’s (1957) distributional dictum (“you shall know a word by the company it keeps”); usage-based linguistics, which models grammar as a network of constructions learned from use; and construction grammar (Goldberg, 1995), which treats lexical and syntactic units alike as form–meaning pairings. Each permits “meaning” to be a conventionalised pairing of a form with a </w:t>
+        <w:t xml:space="preserve"> falls squarely in the use-governed, non-ostensive class he had in mind. Three further frameworks bear on slang: Firth’s (1957) distributional dictum (“you shall know a word by the company it keeps”); usage-based linguistics, which models grammar as a network of constructions learned from use (Bybee, 2010); and construction grammar (Goldberg, 1995), which treats lexical and syntactic units alike as form–meaning pairings. Each permits “meaning” to be a conventionalised pairing of a form with a </w:t>
       </w:r>
       <w:r>
         <w:rPr>
@@ -4583,6 +4583,34 @@
           <w:rFonts w:ascii="Times New Roman" w:hAnsi="Times New Roman"/>
           <w:sz w:val="20"/>
         </w:rPr>
+        <w:t xml:space="preserve">Blakemore, D. (2002). </w:t>
+      </w:r>
+      <w:r>
+        <w:rPr>
+          <w:rFonts w:ascii="Times New Roman" w:hAnsi="Times New Roman"/>
+          <w:i/>
+          <w:sz w:val="20"/>
+        </w:rPr>
+        <w:t>Relevance and linguistic meaning: The semantics and pragmatics of discourse markers</w:t>
+      </w:r>
+      <w:r>
+        <w:rPr>
+          <w:rFonts w:ascii="Times New Roman" w:hAnsi="Times New Roman"/>
+          <w:sz w:val="20"/>
+        </w:rPr>
+        <w:t>. Cambridge University Press.</w:t>
+      </w:r>
+    </w:p>
+    <w:p>
+      <w:pPr>
+        <w:spacing w:before="0" w:after="80" w:line="240" w:lineRule="auto"/>
+        <w:ind w:left="720" w:hanging="720"/>
+      </w:pPr>
+      <w:r>
+        <w:rPr>
+          <w:rFonts w:ascii="Times New Roman" w:hAnsi="Times New Roman"/>
+          <w:sz w:val="20"/>
+        </w:rPr>
         <w:t xml:space="preserve">Bleacher Report. (n.d.). </w:t>
       </w:r>
       <w:r>
@@ -4622,7 +4650,7 @@
           <w:rFonts w:ascii="Times New Roman" w:hAnsi="Times New Roman"/>
           <w:sz w:val="20"/>
         </w:rPr>
-        <w:t xml:space="preserve">Blakemore, D. (2002). </w:t>
+        <w:t xml:space="preserve">Bybee, J. (2010). </w:t>
       </w:r>
       <w:r>
         <w:rPr>
@@ -4630,7 +4658,7 @@
           <w:i/>
           <w:sz w:val="20"/>
         </w:rPr>
-        <w:t>Relevance and linguistic meaning: The semantics and pragmatics of discourse markers</w:t>
+        <w:t>Language, usage and cognition</w:t>
       </w:r>
       <w:r>
         <w:rPr>
@@ -4728,6 +4756,34 @@
           <w:rFonts w:ascii="Times New Roman" w:hAnsi="Times New Roman"/>
           <w:sz w:val="20"/>
         </w:rPr>
+        <w:t xml:space="preserve">Cruse, D. A. (1986). </w:t>
+      </w:r>
+      <w:r>
+        <w:rPr>
+          <w:rFonts w:ascii="Times New Roman" w:hAnsi="Times New Roman"/>
+          <w:i/>
+          <w:sz w:val="20"/>
+        </w:rPr>
+        <w:t>Lexical semantics</w:t>
+      </w:r>
+      <w:r>
+        <w:rPr>
+          <w:rFonts w:ascii="Times New Roman" w:hAnsi="Times New Roman"/>
+          <w:sz w:val="20"/>
+        </w:rPr>
+        <w:t>. Cambridge University Press.</w:t>
+      </w:r>
+    </w:p>
+    <w:p>
+      <w:pPr>
+        <w:spacing w:before="0" w:after="80" w:line="240" w:lineRule="auto"/>
+        <w:ind w:left="720" w:hanging="720"/>
+      </w:pPr>
+      <w:r>
+        <w:rPr>
+          <w:rFonts w:ascii="Times New Roman" w:hAnsi="Times New Roman"/>
+          <w:sz w:val="20"/>
+        </w:rPr>
         <w:t xml:space="preserve">Davidson, D. (1967). Truth and meaning. </w:t>
       </w:r>
       <w:r>
@@ -5780,7 +5836,7 @@
           <w:rFonts w:ascii="Times New Roman" w:hAnsi="Times New Roman"/>
           <w:sz w:val="20"/>
         </w:rPr>
-        <w:t xml:space="preserve">Today. (2024, June 27). </w:t>
+        <w:t xml:space="preserve">Tarski, A. (1944). The semantic conception of truth and the foundations of semantics. </w:t>
       </w:r>
       <w:r>
         <w:rPr>
@@ -5788,6 +5844,45 @@
           <w:i/>
           <w:sz w:val="20"/>
         </w:rPr>
+        <w:t>Philosophy and Phenomenological Research, 4</w:t>
+      </w:r>
+      <w:r>
+        <w:rPr>
+          <w:rFonts w:ascii="Times New Roman" w:hAnsi="Times New Roman"/>
+          <w:sz w:val="20"/>
+        </w:rPr>
+        <w:t xml:space="preserve">(3), 341–376. </w:t>
+      </w:r>
+      <w:hyperlink r:id="rId34">
+        <w:r>
+          <w:rPr>
+            <w:rFonts w:ascii="Times New Roman" w:hAnsi="Times New Roman"/>
+            <w:sz w:val="20"/>
+            <w:color w:val="0000FF"/>
+            <w:u w:val="single"/>
+          </w:rPr>
+          <w:t xml:space="preserve">https://doi.org/10.2307/2102968</w:t>
+        </w:r>
+      </w:hyperlink>
+    </w:p>
+    <w:p>
+      <w:pPr>
+        <w:spacing w:before="0" w:after="80" w:line="240" w:lineRule="auto"/>
+        <w:ind w:left="720" w:hanging="720"/>
+      </w:pPr>
+      <w:r>
+        <w:rPr>
+          <w:rFonts w:ascii="Times New Roman" w:hAnsi="Times New Roman"/>
+          <w:sz w:val="20"/>
+        </w:rPr>
+        <w:t xml:space="preserve">Today. (2024, June 27). </w:t>
+      </w:r>
+      <w:r>
+        <w:rPr>
+          <w:rFonts w:ascii="Times New Roman" w:hAnsi="Times New Roman"/>
+          <w:i/>
+          <w:sz w:val="20"/>
+        </w:rPr>
         <w:t>What does “skibidi” mean?</w:t>
       </w:r>
       <w:r>
@@ -5797,7 +5892,7 @@
         </w:rPr>
         <w:t xml:space="preserve"> </w:t>
       </w:r>
-      <w:hyperlink r:id="rId34">
+      <w:hyperlink r:id="rId35">
         <w:r>
           <w:rPr>
             <w:rFonts w:ascii="Times New Roman" w:hAnsi="Times New Roman"/>
@@ -5836,7 +5931,7 @@
         </w:rPr>
         <w:t xml:space="preserve">. </w:t>
       </w:r>
-      <w:hyperlink r:id="rId35">
+      <w:hyperlink r:id="rId36">
         <w:r>
           <w:rPr>
             <w:rFonts w:ascii="Times New Roman" w:hAnsi="Times New Roman"/>
@@ -5875,7 +5970,7 @@
         </w:rPr>
         <w:t xml:space="preserve">. </w:t>
       </w:r>
-      <w:hyperlink r:id="rId36">
+      <w:hyperlink r:id="rId37">
         <w:r>
           <w:rPr>
             <w:rFonts w:ascii="Times New Roman" w:hAnsi="Times New Roman"/>

</xml_diff>